<commit_message>
Instructivo SharePoint→SAC: agrega ilustraciones esquemáticas por paso
Añade 6 maquetas tipo wireframe (una por fase) que ilustran las pantallas de
cada paso, con rótulos numerados correlacionados con las tablas. Se aclara en
el documento que son ilustraciones esquemáticas, no capturas reales.

Co-Authored-By: Claude Opus 4.8 <noreply@anthropic.com>
</commit_message>
<xml_diff>
--- a/Instructivo_Conexion_SharePoint_SAC.docx
+++ b/Instructivo_Conexion_SharePoint_SAC.docx
@@ -1749,6 +1749,90 @@
         <w:t>Procedimiento</w:t>
       </w:r>
     </w:p>
+    <w:tbl>
+      <w:tblPr>
+        <w:tblStyle w:val="TableGrid"/>
+        <w:tblW w:type="auto" w:w="0"/>
+        <w:jc w:val="center"/>
+        <w:tblLayout w:type="fixed"/>
+        <w:tblLook w:firstColumn="1" w:firstRow="1" w:lastColumn="0" w:lastRow="0" w:noHBand="0" w:noVBand="1" w:val="04A0"/>
+        <w:tblLayout w:type="fixed"/>
+        <w:tblBorders>
+          <w:top w:val="single" w:sz="8" w:space="0" w:color="2E5496"/>
+          <w:left w:val="single" w:sz="8" w:space="0" w:color="2E5496"/>
+          <w:bottom w:val="single" w:sz="8" w:space="0" w:color="2E5496"/>
+          <w:right w:val="single" w:sz="8" w:space="0" w:color="2E5496"/>
+          <w:insideH w:val="single" w:sz="8" w:space="0" w:color="2E5496"/>
+          <w:insideV w:val="single" w:sz="8" w:space="0" w:color="2E5496"/>
+        </w:tblBorders>
+      </w:tblPr>
+      <w:tblGrid>
+        <w:gridCol w:w="9506"/>
+      </w:tblGrid>
+      <w:tr>
+        <w:tc>
+          <w:tcPr>
+            <w:tcW w:type="dxa" w:w="9504"/>
+            <w:shd w:val="clear" w:color="auto" w:fill="2E5496"/>
+            <w:vAlign w:val="center"/>
+            <w:tcMar>
+              <w:top w:w="50" w:type="dxa"/>
+              <w:bottom w:w="50" w:type="dxa"/>
+              <w:start w:w="80" w:type="dxa"/>
+              <w:end w:w="80" w:type="dxa"/>
+            </w:tcMar>
+          </w:tcPr>
+          <w:p>
+            <w:pPr>
+              <w:spacing w:after="20" w:before="20"/>
+              <w:jc w:val="left"/>
+            </w:pPr>
+            <w:r>
+              <w:rPr>
+                <w:rFonts w:ascii="Arial" w:hAnsi="Arial"/>
+                <w:b/>
+                <w:i w:val="0"/>
+                <w:color w:val="FFFFFF"/>
+                <w:sz w:val="18"/>
+              </w:rPr>
+              <w:t>●  Sobre las figuras de este apartado</w:t>
+            </w:r>
+          </w:p>
+        </w:tc>
+      </w:tr>
+      <w:tr>
+        <w:tc>
+          <w:tcPr>
+            <w:tcW w:type="dxa" w:w="9504"/>
+            <w:shd w:val="clear" w:color="auto" w:fill="EAF1FB"/>
+            <w:vAlign w:val="center"/>
+            <w:tcMar>
+              <w:top w:w="60" w:type="dxa"/>
+              <w:bottom w:w="60" w:type="dxa"/>
+              <w:start w:w="80" w:type="dxa"/>
+              <w:end w:w="80" w:type="dxa"/>
+            </w:tcMar>
+          </w:tcPr>
+          <w:p>
+            <w:pPr>
+              <w:spacing w:after="40" w:before="0"/>
+            </w:pPr>
+            <w:r>
+              <w:rPr>
+                <w:rFonts w:ascii="Arial" w:hAnsi="Arial"/>
+                <w:sz w:val="17"/>
+              </w:rPr>
+              <w:t>Las imágenes son ilustraciones esquemáticas de las pantallas (wireframes), no capturas reales. Los rótulos numerados corresponden a los pasos de la tabla de cada fase. La interfaz real de SAP puede variar según la versión.</w:t>
+            </w:r>
+          </w:p>
+        </w:tc>
+      </w:tr>
+    </w:tbl>
+    <w:p>
+      <w:pPr>
+        <w:spacing w:after="120" w:before="0"/>
+      </w:pPr>
+    </w:p>
     <w:p>
       <w:pPr>
         <w:pStyle w:val="Heading2"/>
@@ -2396,6 +2480,61 @@
     </w:p>
     <w:p>
       <w:pPr>
+        <w:spacing w:before="120" w:after="40"/>
+        <w:jc w:val="center"/>
+      </w:pPr>
+      <w:r>
+        <w:drawing>
+          <wp:inline>
+            <wp:extent cx="6035040" cy="4193199"/>
+            <wp:docPr id="4" name="Picture 4"/>
+            <wp:cNvGraphicFramePr>
+              <a:graphicFrameLocks noChangeAspect="1"/>
+            </wp:cNvGraphicFramePr>
+            <a:graphic>
+              <a:graphicData uri="http://schemas.openxmlformats.org/drawingml/2006/picture">
+                <pic:pic>
+                  <pic:nvPicPr>
+                    <pic:cNvPr id="0" name="paso1_sac_openconnectors.png"/>
+                    <pic:cNvPicPr/>
+                  </pic:nvPicPr>
+                  <pic:blipFill>
+                    <a:blip r:embed="rId28"/>
+                    <a:stretch>
+                      <a:fillRect/>
+                    </a:stretch>
+                  </pic:blipFill>
+                  <pic:spPr>
+                    <a:xfrm>
+                      <a:off x="0" y="0"/>
+                      <a:ext cx="6035040" cy="4193199"/>
+                    </a:xfrm>
+                    <a:prstGeom prst="rect"/>
+                  </pic:spPr>
+                </pic:pic>
+              </a:graphicData>
+            </a:graphic>
+          </wp:inline>
+        </w:drawing>
+      </w:r>
+    </w:p>
+    <w:p>
+      <w:pPr>
+        <w:spacing w:after="200"/>
+        <w:jc w:val="center"/>
+      </w:pPr>
+      <w:r>
+        <w:rPr>
+          <w:rFonts w:ascii="Arial" w:hAnsi="Arial"/>
+          <w:i/>
+          <w:color w:val="595959"/>
+          <w:sz w:val="17"/>
+        </w:rPr>
+        <w:t>Figura 2. Ilustración esquemática — integración de Open Connectors en SAP Analytics Cloud (los números corresponden a los pasos).</w:t>
+      </w:r>
+    </w:p>
+    <w:p>
+      <w:pPr>
         <w:pStyle w:val="Heading2"/>
         <w:keepNext/>
         <w:spacing w:before="200" w:after="80"/>
@@ -2953,6 +3092,61 @@
         <w:spacing w:after="80" w:before="0"/>
       </w:pPr>
     </w:p>
+    <w:p>
+      <w:pPr>
+        <w:spacing w:before="120" w:after="40"/>
+        <w:jc w:val="center"/>
+      </w:pPr>
+      <w:r>
+        <w:drawing>
+          <wp:inline>
+            <wp:extent cx="6035040" cy="4193199"/>
+            <wp:docPr id="5" name="Picture 5"/>
+            <wp:cNvGraphicFramePr>
+              <a:graphicFrameLocks noChangeAspect="1"/>
+            </wp:cNvGraphicFramePr>
+            <a:graphic>
+              <a:graphicData uri="http://schemas.openxmlformats.org/drawingml/2006/picture">
+                <pic:pic>
+                  <pic:nvPicPr>
+                    <pic:cNvPr id="0" name="paso2a_azure_appreg.png"/>
+                    <pic:cNvPicPr/>
+                  </pic:nvPicPr>
+                  <pic:blipFill>
+                    <a:blip r:embed="rId29"/>
+                    <a:stretch>
+                      <a:fillRect/>
+                    </a:stretch>
+                  </pic:blipFill>
+                  <pic:spPr>
+                    <a:xfrm>
+                      <a:off x="0" y="0"/>
+                      <a:ext cx="6035040" cy="4193199"/>
+                    </a:xfrm>
+                    <a:prstGeom prst="rect"/>
+                  </pic:spPr>
+                </pic:pic>
+              </a:graphicData>
+            </a:graphic>
+          </wp:inline>
+        </w:drawing>
+      </w:r>
+    </w:p>
+    <w:p>
+      <w:pPr>
+        <w:spacing w:after="200"/>
+        <w:jc w:val="center"/>
+      </w:pPr>
+      <w:r>
+        <w:rPr>
+          <w:rFonts w:ascii="Arial" w:hAnsi="Arial"/>
+          <w:i/>
+          <w:color w:val="595959"/>
+          <w:sz w:val="17"/>
+        </w:rPr>
+        <w:t>Figura 3. Ilustración esquemática — registro de la aplicación en Azure (Microsoft Entra ID) (los números corresponden a los pasos).</w:t>
+      </w:r>
+    </w:p>
     <w:tbl>
       <w:tblPr>
         <w:tblStyle w:val="TableGrid"/>
@@ -3036,6 +3230,61 @@
       <w:pPr>
         <w:spacing w:after="120" w:before="0"/>
       </w:pPr>
+    </w:p>
+    <w:p>
+      <w:pPr>
+        <w:spacing w:before="120" w:after="40"/>
+        <w:jc w:val="center"/>
+      </w:pPr>
+      <w:r>
+        <w:drawing>
+          <wp:inline>
+            <wp:extent cx="6035040" cy="4193199"/>
+            <wp:docPr id="6" name="Picture 6"/>
+            <wp:cNvGraphicFramePr>
+              <a:graphicFrameLocks noChangeAspect="1"/>
+            </wp:cNvGraphicFramePr>
+            <a:graphic>
+              <a:graphicData uri="http://schemas.openxmlformats.org/drawingml/2006/picture">
+                <pic:pic>
+                  <pic:nvPicPr>
+                    <pic:cNvPr id="0" name="paso2b_azure_secret.png"/>
+                    <pic:cNvPicPr/>
+                  </pic:nvPicPr>
+                  <pic:blipFill>
+                    <a:blip r:embed="rId30"/>
+                    <a:stretch>
+                      <a:fillRect/>
+                    </a:stretch>
+                  </pic:blipFill>
+                  <pic:spPr>
+                    <a:xfrm>
+                      <a:off x="0" y="0"/>
+                      <a:ext cx="6035040" cy="4193199"/>
+                    </a:xfrm>
+                    <a:prstGeom prst="rect"/>
+                  </pic:spPr>
+                </pic:pic>
+              </a:graphicData>
+            </a:graphic>
+          </wp:inline>
+        </w:drawing>
+      </w:r>
+    </w:p>
+    <w:p>
+      <w:pPr>
+        <w:spacing w:after="200"/>
+        <w:jc w:val="center"/>
+      </w:pPr>
+      <w:r>
+        <w:rPr>
+          <w:rFonts w:ascii="Arial" w:hAnsi="Arial"/>
+          <w:i/>
+          <w:color w:val="595959"/>
+          <w:sz w:val="17"/>
+        </w:rPr>
+        <w:t>Figura 4. Ilustración esquemática — generación del Client Secret en Azure (los números corresponden a los pasos).</w:t>
+      </w:r>
     </w:p>
     <w:p>
       <w:pPr>
@@ -3875,6 +4124,61 @@
     </w:p>
     <w:p>
       <w:pPr>
+        <w:spacing w:before="120" w:after="40"/>
+        <w:jc w:val="center"/>
+      </w:pPr>
+      <w:r>
+        <w:drawing>
+          <wp:inline>
+            <wp:extent cx="6035040" cy="4193199"/>
+            <wp:docPr id="7" name="Picture 7"/>
+            <wp:cNvGraphicFramePr>
+              <a:graphicFrameLocks noChangeAspect="1"/>
+            </wp:cNvGraphicFramePr>
+            <a:graphic>
+              <a:graphicData uri="http://schemas.openxmlformats.org/drawingml/2006/picture">
+                <pic:pic>
+                  <pic:nvPicPr>
+                    <pic:cNvPr id="0" name="paso3_openconnectors_instance.png"/>
+                    <pic:cNvPicPr/>
+                  </pic:nvPicPr>
+                  <pic:blipFill>
+                    <a:blip r:embed="rId31"/>
+                    <a:stretch>
+                      <a:fillRect/>
+                    </a:stretch>
+                  </pic:blipFill>
+                  <pic:spPr>
+                    <a:xfrm>
+                      <a:off x="0" y="0"/>
+                      <a:ext cx="6035040" cy="4193199"/>
+                    </a:xfrm>
+                    <a:prstGeom prst="rect"/>
+                  </pic:spPr>
+                </pic:pic>
+              </a:graphicData>
+            </a:graphic>
+          </wp:inline>
+        </w:drawing>
+      </w:r>
+    </w:p>
+    <w:p>
+      <w:pPr>
+        <w:spacing w:after="200"/>
+        <w:jc w:val="center"/>
+      </w:pPr>
+      <w:r>
+        <w:rPr>
+          <w:rFonts w:ascii="Arial" w:hAnsi="Arial"/>
+          <w:i/>
+          <w:color w:val="595959"/>
+          <w:sz w:val="17"/>
+        </w:rPr>
+        <w:t>Figura 5. Ilustración esquemática — instancia del conector SharePoint en Open Connectors (los números corresponden a los pasos).</w:t>
+      </w:r>
+    </w:p>
+    <w:p>
+      <w:pPr>
         <w:pStyle w:val="Heading2"/>
         <w:keepNext/>
         <w:spacing w:before="200" w:after="80"/>
@@ -4942,6 +5246,61 @@
     </w:p>
     <w:p>
       <w:pPr>
+        <w:spacing w:before="120" w:after="40"/>
+        <w:jc w:val="center"/>
+      </w:pPr>
+      <w:r>
+        <w:drawing>
+          <wp:inline>
+            <wp:extent cx="6035040" cy="4723374"/>
+            <wp:docPr id="8" name="Picture 8"/>
+            <wp:cNvGraphicFramePr>
+              <a:graphicFrameLocks noChangeAspect="1"/>
+            </wp:cNvGraphicFramePr>
+            <a:graphic>
+              <a:graphicData uri="http://schemas.openxmlformats.org/drawingml/2006/picture">
+                <pic:pic>
+                  <pic:nvPicPr>
+                    <pic:cNvPr id="0" name="paso4_sac_conexion.png"/>
+                    <pic:cNvPicPr/>
+                  </pic:nvPicPr>
+                  <pic:blipFill>
+                    <a:blip r:embed="rId32"/>
+                    <a:stretch>
+                      <a:fillRect/>
+                    </a:stretch>
+                  </pic:blipFill>
+                  <pic:spPr>
+                    <a:xfrm>
+                      <a:off x="0" y="0"/>
+                      <a:ext cx="6035040" cy="4723374"/>
+                    </a:xfrm>
+                    <a:prstGeom prst="rect"/>
+                  </pic:spPr>
+                </pic:pic>
+              </a:graphicData>
+            </a:graphic>
+          </wp:inline>
+        </w:drawing>
+      </w:r>
+    </w:p>
+    <w:p>
+      <w:pPr>
+        <w:spacing w:after="200"/>
+        <w:jc w:val="center"/>
+      </w:pPr>
+      <w:r>
+        <w:rPr>
+          <w:rFonts w:ascii="Arial" w:hAnsi="Arial"/>
+          <w:i/>
+          <w:color w:val="595959"/>
+          <w:sz w:val="17"/>
+        </w:rPr>
+        <w:t>Figura 6. Ilustración esquemática — conexión de importación a SharePoint en SAP Analytics Cloud (los números corresponden a los pasos).</w:t>
+      </w:r>
+    </w:p>
+    <w:p>
+      <w:pPr>
         <w:pStyle w:val="Heading2"/>
         <w:keepNext/>
         <w:spacing w:before="200" w:after="80"/>
@@ -5400,6 +5759,61 @@
       <w:pPr>
         <w:spacing w:after="80" w:before="0"/>
       </w:pPr>
+    </w:p>
+    <w:p>
+      <w:pPr>
+        <w:spacing w:before="120" w:after="40"/>
+        <w:jc w:val="center"/>
+      </w:pPr>
+      <w:r>
+        <w:drawing>
+          <wp:inline>
+            <wp:extent cx="6035040" cy="4193199"/>
+            <wp:docPr id="9" name="Picture 9"/>
+            <wp:cNvGraphicFramePr>
+              <a:graphicFrameLocks noChangeAspect="1"/>
+            </wp:cNvGraphicFramePr>
+            <a:graphic>
+              <a:graphicData uri="http://schemas.openxmlformats.org/drawingml/2006/picture">
+                <pic:pic>
+                  <pic:nvPicPr>
+                    <pic:cNvPr id="0" name="paso5_sac_importar.png"/>
+                    <pic:cNvPicPr/>
+                  </pic:nvPicPr>
+                  <pic:blipFill>
+                    <a:blip r:embed="rId33"/>
+                    <a:stretch>
+                      <a:fillRect/>
+                    </a:stretch>
+                  </pic:blipFill>
+                  <pic:spPr>
+                    <a:xfrm>
+                      <a:off x="0" y="0"/>
+                      <a:ext cx="6035040" cy="4193199"/>
+                    </a:xfrm>
+                    <a:prstGeom prst="rect"/>
+                  </pic:spPr>
+                </pic:pic>
+              </a:graphicData>
+            </a:graphic>
+          </wp:inline>
+        </w:drawing>
+      </w:r>
+    </w:p>
+    <w:p>
+      <w:pPr>
+        <w:spacing w:after="200"/>
+        <w:jc w:val="center"/>
+      </w:pPr>
+      <w:r>
+        <w:rPr>
+          <w:rFonts w:ascii="Arial" w:hAnsi="Arial"/>
+          <w:i/>
+          <w:color w:val="595959"/>
+          <w:sz w:val="17"/>
+        </w:rPr>
+        <w:t>Figura 7. Ilustración esquemática — adquisición e importación de datos en SAP Analytics Cloud (los números corresponden a los pasos).</w:t>
+      </w:r>
     </w:p>
     <w:p>
       <w:pPr>

</xml_diff>